<commit_message>
Add direct download link and button for Final_Project_Report.docx
</commit_message>
<xml_diff>
--- a/Final_Project_Report.docx
+++ b/Final_Project_Report.docx
@@ -255,18 +255,7 @@
             <ns0:tcW ns0:type="dxa" ns0:w="2268"/>
           </ns0:tcPr>
           <ns0:p>
-            <ns0:pPr>
-              <ns0:spacing ns0:after="20" ns0:line="240" ns0:lineRule="auto"/>
-            </ns0:pPr>
             <ns0:r>
-              <ns0:rPr>
-                <ns0:sz ns0:val="18"/>
-              </ns0:rPr>
-            </ns0:r>
-            <ns0:r>
-              <ns0:rPr>
-                <ns0:sz ns0:val="18"/>
-              </ns0:rPr>
               <ns0:t>Team member 1</ns0:t>
             </ns0:r>
           </ns0:p>
@@ -276,33 +265,8 @@
             <ns0:tcW ns0:type="dxa" ns0:w="7370"/>
           </ns0:tcPr>
           <ns0:p>
-            <ns0:pPr>
-              <ns0:spacing ns0:after="20" ns0:line="240" ns0:lineRule="auto"/>
-            </ns0:pPr>
             <ns0:r>
-              <ns0:rPr>
-                <ns0:sz ns0:val="18"/>
-              </ns0:rPr>
-            </ns0:r>
-            <ns0:r>
-              <ns0:rPr>
-                <ns0:sz ns0:val="18"/>
-                <ns0:highlight ns0:val="yellow"/>
-              </ns0:rPr>
-              <ns0:t>Full name</ns0:t>
-            </ns0:r>
-            <ns0:r>
-              <ns0:rPr>
-                <ns0:sz ns0:val="18"/>
-              </ns0:rPr>
-              <ns0:t xml:space="preserve">  —  ID </ns0:t>
-            </ns0:r>
-            <ns0:r>
-              <ns0:rPr>
-                <ns0:sz ns0:val="18"/>
-                <ns0:highlight ns0:val="yellow"/>
-              </ns0:rPr>
-              <ns0:t>000000000</ns0:t>
+              <ns0:t>נועה בן שבת  ·  ID 212974026</ns0:t>
             </ns0:r>
           </ns0:p>
         </ns0:tc>
@@ -314,18 +278,7 @@
             <ns0:shd ns0:val="clear" ns0:color="auto" ns0:fill="F2F5F9"/>
           </ns0:tcPr>
           <ns0:p>
-            <ns0:pPr>
-              <ns0:spacing ns0:after="20" ns0:line="240" ns0:lineRule="auto"/>
-            </ns0:pPr>
             <ns0:r>
-              <ns0:rPr>
-                <ns0:sz ns0:val="18"/>
-              </ns0:rPr>
-            </ns0:r>
-            <ns0:r>
-              <ns0:rPr>
-                <ns0:sz ns0:val="18"/>
-              </ns0:rPr>
               <ns0:t>Team member 2</ns0:t>
             </ns0:r>
           </ns0:p>
@@ -336,91 +289,8 @@
             <ns0:shd ns0:val="clear" ns0:color="auto" ns0:fill="F2F5F9"/>
           </ns0:tcPr>
           <ns0:p>
-            <ns0:pPr>
-              <ns0:spacing ns0:after="20" ns0:line="240" ns0:lineRule="auto"/>
-            </ns0:pPr>
             <ns0:r>
-              <ns0:rPr>
-                <ns0:sz ns0:val="18"/>
-              </ns0:rPr>
-            </ns0:r>
-            <ns0:r>
-              <ns0:rPr>
-                <ns0:sz ns0:val="18"/>
-                <ns0:highlight ns0:val="yellow"/>
-              </ns0:rPr>
-              <ns0:t>Full name</ns0:t>
-            </ns0:r>
-            <ns0:r>
-              <ns0:rPr>
-                <ns0:sz ns0:val="18"/>
-              </ns0:rPr>
-              <ns0:t xml:space="preserve">  —  ID </ns0:t>
-            </ns0:r>
-            <ns0:r>
-              <ns0:rPr>
-                <ns0:sz ns0:val="18"/>
-                <ns0:highlight ns0:val="yellow"/>
-              </ns0:rPr>
-              <ns0:t>000000000</ns0:t>
-            </ns0:r>
-          </ns0:p>
-        </ns0:tc>
-      </ns0:tr>
-      <ns0:tr>
-        <ns0:tc>
-          <ns0:tcPr>
-            <ns0:tcW ns0:type="dxa" ns0:w="2268"/>
-          </ns0:tcPr>
-          <ns0:p>
-            <ns0:pPr>
-              <ns0:spacing ns0:after="20" ns0:line="240" ns0:lineRule="auto"/>
-            </ns0:pPr>
-            <ns0:r>
-              <ns0:rPr>
-                <ns0:sz ns0:val="18"/>
-              </ns0:rPr>
-            </ns0:r>
-            <ns0:r>
-              <ns0:rPr>
-                <ns0:sz ns0:val="18"/>
-              </ns0:rPr>
-              <ns0:t>Team member 3</ns0:t>
-            </ns0:r>
-          </ns0:p>
-        </ns0:tc>
-        <ns0:tc>
-          <ns0:tcPr>
-            <ns0:tcW ns0:type="dxa" ns0:w="7370"/>
-          </ns0:tcPr>
-          <ns0:p>
-            <ns0:pPr>
-              <ns0:spacing ns0:after="20" ns0:line="240" ns0:lineRule="auto"/>
-            </ns0:pPr>
-            <ns0:r>
-              <ns0:rPr>
-                <ns0:sz ns0:val="18"/>
-              </ns0:rPr>
-            </ns0:r>
-            <ns0:r>
-              <ns0:rPr>
-                <ns0:sz ns0:val="18"/>
-                <ns0:highlight ns0:val="yellow"/>
-              </ns0:rPr>
-              <ns0:t>Full name</ns0:t>
-            </ns0:r>
-            <ns0:r>
-              <ns0:rPr>
-                <ns0:sz ns0:val="18"/>
-              </ns0:rPr>
-              <ns0:t xml:space="preserve">  —  ID </ns0:t>
-            </ns0:r>
-            <ns0:r>
-              <ns0:rPr>
-                <ns0:sz ns0:val="18"/>
-                <ns0:highlight ns0:val="yellow"/>
-              </ns0:rPr>
-              <ns0:t>000000000</ns0:t>
+              <ns0:t>מאי ברק  ·  ID 213485923</ns0:t>
             </ns0:r>
           </ns0:p>
         </ns0:tc>

</xml_diff>